<commit_message>
Added advanced AI tools, contract editor, dashboards, compliance and negotiation features
</commit_message>
<xml_diff>
--- a/backend/temp_downloads/Edited_Contract.docx
+++ b/backend/temp_downloads/Edited_Contract.docx
@@ -10000,21 +10000,8 @@
     <w:p>
       <w:r>
         <w:t>Annex A – Potential Amendments to Conditions to Revolving Credit Facility or any Incremental Facility</w:t>
-        <w:br/>
-      </w:r>
-    </w:p>
-    <w:p>
-      <w:r>
-        <w:br/>
-      </w:r>
-    </w:p>
-    <w:p>
-      <w:r>
-        <w:t>Revise the definition to require a standstill provision. For example: '...provided that such confidentiality agreement shall contain a standstill provision that is not materially less restrictive to the counterparty than the standstill provisions contained in the Confidentiality Agreement between the Company and an Affiliate of the Merger Corporation.'</w:t>
-        <w:br/>
-      </w:r>
-    </w:p>
-    <w:p/>
+      </w:r>
+    </w:p>
     <w:sectPr>
       <w:pgSz w:w="12240" w:h="15840"/>
       <w:pgMar w:top="1440" w:right="1800" w:bottom="1440" w:left="1800" w:header="720" w:footer="720" w:gutter="0"/>

</xml_diff>